<commit_message>
Close package-repo publishing and Databricks Volumes verification
Both were raised as open backlog items after the hashing/schema-validation
milestone; the user decided to skip package-repo publishing outright and
to treat the Unity Catalog Volumes install path as sufficiently explained
in docs/operations.md rather than something to verify against a live
workspace. Updates README.md's backlog, CLAUDE.md's open items, and
docs/architecture.md + operations.md (Chapter VI reframed from "pending
access" to "decided out of scope, documented rather than pursued";
regenerated .docx) to reflect the decision instead of leaving them as
open, blocked-on-the-user items.

Co-Authored-By: Claude Sonnet 5 <noreply@anthropic.com>
</commit_message>
<xml_diff>
--- a/docs/architecture.docx
+++ b/docs/architecture.docx
@@ -122,7 +122,7 @@
           <w:rFonts w:ascii="Times New Roman" w:hAnsi="Times New Roman" w:eastAsia="Batang"/>
           <w:sz w:val="22"/>
         </w:rPr>
-        <w:t xml:space="preserve"> 1.3 </w:t>
+        <w:t xml:space="preserve"> 1.4 </w:t>
       </w:r>
       <w:r>
         <w:rPr>
@@ -10479,7 +10479,7 @@
           <w:rFonts w:ascii="Times New Roman" w:hAnsi="Times New Roman" w:eastAsia="Batang"/>
           <w:sz w:val="22"/>
         </w:rPr>
-        <w:t xml:space="preserve">Open, tracked separately from the Rust/Python surface itself because neither is a matter of more code: publishing to a package repository (needs credentials this repository's automation does not have) and verifying installation from a Unity Catalog Volume against a real Databricks workspace (needs access this development environment does not have); see </w:t>
+        <w:t xml:space="preserve">Publishing to a package repository and verifying installation from a Unity Catalog Volume against a live workspace were both raised and then deliberately decided against pursuing further (2026-09-16): the project stays wheel-only, and the Volumes install path is documented as the standard, sufficient procedure rather than something this repository additionally verifies live; see </w:t>
       </w:r>
       <w:r>
         <w:rPr>
@@ -10493,7 +10493,7 @@
           <w:rFonts w:ascii="Times New Roman" w:hAnsi="Times New Roman" w:eastAsia="Batang"/>
           <w:sz w:val="22"/>
         </w:rPr>
-        <w:t xml:space="preserve"> Chapter VI for both. Also open: broader </w:t>
+        <w:t xml:space="preserve"> Chapter VI, Section 2 for the reasoning. Still open: broader </w:t>
       </w:r>
       <w:r>
         <w:rPr>

</xml_diff>